<commit_message>
correçoes nos arquivos de referencias da aula 03
</commit_message>
<xml_diff>
--- a/referencias/aula-03/vinheta-2-sr-aparecido.docx
+++ b/referencias/aula-03/vinheta-2-sr-aparecido.docx
@@ -73,7 +73,23 @@
           <w:sz w:val="24"/>
           <w:szCs w:val="24"/>
         </w:rPr>
-        <w:t>Encaminhado pela pneumologia com a hipótese de “possível depressão”, depois de dizer à médica que “não vale mais a pena”.</w:t>
+        <w:t xml:space="preserve">Encaminhado pela pneumologia com a </w:t>
+      </w:r>
+      <w:r>
+        <w:rPr>
+          <w:color w:val="4A4A45"/>
+          <w:sz w:val="24"/>
+          <w:szCs w:val="24"/>
+        </w:rPr>
+        <w:t>queixa</w:t>
+      </w:r>
+      <w:r>
+        <w:rPr>
+          <w:color w:val="4A4A45"/>
+          <w:sz w:val="24"/>
+          <w:szCs w:val="24"/>
+        </w:rPr>
+        <w:t xml:space="preserve"> de “possível depressão”, depois de dizer à médica que “não vale mais a pena”.</w:t>
       </w:r>
     </w:p>
     <w:p>
@@ -87,11 +103,21 @@
       </w:pPr>
       <w:r>
         <w:rPr>
+          <w:b/>
+          <w:bCs/>
           <w:color w:val="4A4A45"/>
           <w:sz w:val="24"/>
           <w:szCs w:val="24"/>
         </w:rPr>
-        <w:t>DPOC — doença pulmonar obstrutiva crônica.</w:t>
+        <w:t>DPOC</w:t>
+      </w:r>
+      <w:r>
+        <w:rPr>
+          <w:color w:val="4A4A45"/>
+          <w:sz w:val="24"/>
+          <w:szCs w:val="24"/>
+        </w:rPr>
+        <w:t xml:space="preserve"> — doença pulmonar obstrutiva crônica.</w:t>
       </w:r>
     </w:p>
     <w:p>
@@ -1738,7 +1764,12 @@
     </w:p>
     <w:p>
       <w:pPr>
-        <w:spacing w:after="60"/>
+        <w:spacing w:after="0" w:line="240" w:lineRule="auto"/>
+        <w:rPr>
+          <w:color w:val="7F7F7F" w:themeColor="text1" w:themeTint="80"/>
+          <w:sz w:val="20"/>
+          <w:szCs w:val="20"/>
+        </w:rPr>
       </w:pPr>
       <w:r>
         <w:rPr>
@@ -1747,8 +1778,131 @@
         </w:rPr>
         <w:t xml:space="preserve">1.  </w:t>
       </w:r>
-      <w:r>
-        <w:t>Qual foi o escore total e em que faixa ele cai?</w:t>
+      <w:proofErr w:type="spellStart"/>
+      <w:r>
+        <w:rPr>
+          <w:color w:val="7F7F7F" w:themeColor="text1" w:themeTint="80"/>
+          <w:sz w:val="20"/>
+          <w:szCs w:val="20"/>
+        </w:rPr>
+        <w:t>Ex</w:t>
+      </w:r>
+      <w:proofErr w:type="spellEnd"/>
+      <w:r>
+        <w:rPr>
+          <w:color w:val="7F7F7F" w:themeColor="text1" w:themeTint="80"/>
+          <w:sz w:val="20"/>
+          <w:szCs w:val="20"/>
+        </w:rPr>
+        <w:t xml:space="preserve">: </w:t>
+      </w:r>
+      <w:r>
+        <w:rPr>
+          <w:color w:val="7F7F7F" w:themeColor="text1" w:themeTint="80"/>
+          <w:sz w:val="20"/>
+          <w:szCs w:val="20"/>
+        </w:rPr>
+        <w:t>Sr. Aparecido</w:t>
+      </w:r>
+      <w:r>
+        <w:rPr>
+          <w:color w:val="7F7F7F" w:themeColor="text1" w:themeTint="80"/>
+          <w:sz w:val="20"/>
+          <w:szCs w:val="20"/>
+        </w:rPr>
+        <w:t xml:space="preserve"> foi encaminhada a avaliação psicológica por </w:t>
+      </w:r>
+      <w:proofErr w:type="spellStart"/>
+      <w:r>
+        <w:rPr>
+          <w:b/>
+          <w:bCs/>
+          <w:color w:val="7F7F7F" w:themeColor="text1" w:themeTint="80"/>
+          <w:sz w:val="20"/>
+          <w:szCs w:val="20"/>
+        </w:rPr>
+        <w:t>xxxxxxxxxx</w:t>
+      </w:r>
+      <w:proofErr w:type="spellEnd"/>
+      <w:r>
+        <w:rPr>
+          <w:color w:val="7F7F7F" w:themeColor="text1" w:themeTint="80"/>
+          <w:sz w:val="20"/>
+          <w:szCs w:val="20"/>
+        </w:rPr>
+        <w:t xml:space="preserve"> motivo. Durante a avaliação observou-se </w:t>
+      </w:r>
+      <w:proofErr w:type="spellStart"/>
+      <w:r>
+        <w:rPr>
+          <w:b/>
+          <w:bCs/>
+          <w:color w:val="7F7F7F" w:themeColor="text1" w:themeTint="80"/>
+          <w:sz w:val="20"/>
+          <w:szCs w:val="20"/>
+        </w:rPr>
+        <w:t>xxxxxxxx</w:t>
+      </w:r>
+      <w:proofErr w:type="spellEnd"/>
+      <w:r>
+        <w:rPr>
+          <w:color w:val="7F7F7F" w:themeColor="text1" w:themeTint="80"/>
+          <w:sz w:val="20"/>
+          <w:szCs w:val="20"/>
+        </w:rPr>
+        <w:t xml:space="preserve"> o resultado da escala GDS para avaliar sintomas depressivos indicaram </w:t>
+      </w:r>
+      <w:proofErr w:type="spellStart"/>
+      <w:r>
+        <w:rPr>
+          <w:b/>
+          <w:bCs/>
+          <w:color w:val="7F7F7F" w:themeColor="text1" w:themeTint="80"/>
+          <w:sz w:val="20"/>
+          <w:szCs w:val="20"/>
+        </w:rPr>
+        <w:t>xxxxxxxxxxx</w:t>
+      </w:r>
+      <w:proofErr w:type="spellEnd"/>
+      <w:r>
+        <w:rPr>
+          <w:color w:val="7F7F7F" w:themeColor="text1" w:themeTint="80"/>
+          <w:sz w:val="20"/>
+          <w:szCs w:val="20"/>
+        </w:rPr>
+        <w:t>. Assim o resultado da avaliação corrobora/não corrobora (confirma/não confirma) a hipótese/diagnóstico/quadro</w:t>
+      </w:r>
+      <w:r>
+        <w:rPr>
+          <w:b/>
+          <w:bCs/>
+          <w:color w:val="7F7F7F" w:themeColor="text1" w:themeTint="80"/>
+          <w:sz w:val="20"/>
+          <w:szCs w:val="20"/>
+        </w:rPr>
+        <w:t xml:space="preserve"> </w:t>
+      </w:r>
+      <w:proofErr w:type="spellStart"/>
+      <w:r>
+        <w:rPr>
+          <w:b/>
+          <w:bCs/>
+          <w:color w:val="7F7F7F" w:themeColor="text1" w:themeTint="80"/>
+          <w:sz w:val="20"/>
+          <w:szCs w:val="20"/>
+        </w:rPr>
+        <w:t>xxxxxxxxxxx</w:t>
+      </w:r>
+      <w:proofErr w:type="spellEnd"/>
+      <w:r>
+        <w:rPr>
+          <w:b/>
+          <w:bCs/>
+          <w:color w:val="7F7F7F" w:themeColor="text1" w:themeTint="80"/>
+          <w:sz w:val="20"/>
+          <w:szCs w:val="20"/>
+        </w:rPr>
+        <w:t xml:space="preserve"> </w:t>
       </w:r>
     </w:p>
     <w:p>
@@ -1759,225 +1913,16 @@
         <w:spacing w:after="90"/>
       </w:pPr>
       <w:r>
+        <w:t>_________________________________________________________________________________________________________________________________________________________________________________________________________________________________________________________________________________________________________________________________________________________________________________________________________________________________________________________________________________________________________________________________________________________________________________________________________________________________________________________________________________________________________________________________________________________________________________________________________________________________________________________________________________________________________________________________________________________________________________________________________________________________________________________________________________________________________________________________________________________________________________________________________________________________________________________________________________________________________________________________________________________________________________________________________________________________________________________________________________________________________________________________________________________________________________________________________________________________________________________________________________________________________________________________________________________________________________________________________________________________________________________________________________________________________________________________________________________________________________________________________________________________________________________________________________________________________________________________________________________________________________________________________________________________________________________________________________________________________________________________________________________________________________________________________________________________________________________________________________________________________________________________________________________________________________________________________________________________________________________________________________________________</w:t>
+      </w:r>
+      <w:r>
+        <w:t>_________________</w:t>
+      </w:r>
+      <w:r>
         <w:rPr>
           <w:color w:val="FFFFFF"/>
         </w:rPr>
-        <w:t xml:space="preserve">                                                                                                                        </w:t>
-      </w:r>
-    </w:p>
-    <w:p>
-      <w:pPr>
-        <w:pBdr>
-          <w:bottom w:val="single" w:sz="6" w:space="4" w:color="C8C8C0"/>
-        </w:pBdr>
-        <w:spacing w:after="90"/>
-      </w:pPr>
-      <w:r>
-        <w:rPr>
-          <w:color w:val="FFFFFF"/>
-        </w:rPr>
-        <w:t xml:space="preserve">                                                                                                                        </w:t>
-      </w:r>
-    </w:p>
-    <w:p>
-      <w:pPr>
-        <w:spacing w:after="60"/>
-      </w:pPr>
-      <w:r>
-        <w:rPr>
-          <w:b/>
-          <w:color w:val="1D3E6E"/>
-        </w:rPr>
-        <w:t xml:space="preserve">2.  </w:t>
-      </w:r>
-      <w:r>
-        <w:t>Quais itens pontuaram? O que eles têm em comum — e o que isso diz sobre o desenho da GDS?</w:t>
-      </w:r>
-    </w:p>
-    <w:p>
-      <w:pPr>
-        <w:pBdr>
-          <w:bottom w:val="single" w:sz="6" w:space="4" w:color="C8C8C0"/>
-        </w:pBdr>
-        <w:spacing w:after="90"/>
-      </w:pPr>
-      <w:r>
-        <w:rPr>
-          <w:color w:val="FFFFFF"/>
-        </w:rPr>
-        <w:t xml:space="preserve">                                                                                                                        </w:t>
-      </w:r>
-    </w:p>
-    <w:p>
-      <w:pPr>
-        <w:pBdr>
-          <w:bottom w:val="single" w:sz="6" w:space="4" w:color="C8C8C0"/>
-        </w:pBdr>
-        <w:spacing w:after="90"/>
-      </w:pPr>
-      <w:r>
-        <w:rPr>
-          <w:color w:val="FFFFFF"/>
-        </w:rPr>
-        <w:t xml:space="preserve">                                                                                                                        </w:t>
-      </w:r>
-    </w:p>
-    <w:p>
-      <w:pPr>
-        <w:spacing w:after="60"/>
-      </w:pPr>
-      <w:r>
-        <w:rPr>
-          <w:b/>
-          <w:color w:val="1D3E6E"/>
-        </w:rPr>
-        <w:t xml:space="preserve">3.  </w:t>
-      </w:r>
-      <w:r>
-        <w:t>Um rastreio negativo encerra a investigação neste caso? Justifique.</w:t>
-      </w:r>
-    </w:p>
-    <w:p>
-      <w:pPr>
-        <w:pBdr>
-          <w:bottom w:val="single" w:sz="6" w:space="4" w:color="C8C8C0"/>
-        </w:pBdr>
-        <w:spacing w:after="90"/>
-      </w:pPr>
-      <w:r>
-        <w:rPr>
-          <w:color w:val="FFFFFF"/>
-        </w:rPr>
-        <w:t xml:space="preserve">                                                                                                                        </w:t>
-      </w:r>
-    </w:p>
-    <w:p>
-      <w:pPr>
-        <w:pBdr>
-          <w:bottom w:val="single" w:sz="6" w:space="4" w:color="C8C8C0"/>
-        </w:pBdr>
-        <w:spacing w:after="90"/>
-      </w:pPr>
-      <w:r>
-        <w:rPr>
-          <w:color w:val="FFFFFF"/>
-        </w:rPr>
-        <w:t xml:space="preserve">                                                                                                                        </w:t>
-      </w:r>
-    </w:p>
-    <w:p>
-      <w:pPr>
-        <w:spacing w:after="60"/>
-      </w:pPr>
-      <w:r>
-        <w:rPr>
-          <w:b/>
-          <w:color w:val="1D3E6E"/>
-        </w:rPr>
-        <w:t xml:space="preserve">4.  </w:t>
-      </w:r>
-      <w:r>
-        <w:t>A frase “não vale mais a pena” aparece em algum item da escala? Como você investigaria o que ela significa?</w:t>
-      </w:r>
-    </w:p>
-    <w:p>
-      <w:pPr>
-        <w:pBdr>
-          <w:bottom w:val="single" w:sz="6" w:space="4" w:color="C8C8C0"/>
-        </w:pBdr>
-        <w:spacing w:after="90"/>
-      </w:pPr>
-      <w:r>
-        <w:rPr>
-          <w:color w:val="FFFFFF"/>
-        </w:rPr>
-        <w:t xml:space="preserve">                                                                                                                        </w:t>
-      </w:r>
-    </w:p>
-    <w:p>
-      <w:pPr>
-        <w:pBdr>
-          <w:bottom w:val="single" w:sz="6" w:space="4" w:color="C8C8C0"/>
-        </w:pBdr>
-        <w:spacing w:after="90"/>
-      </w:pPr>
-      <w:r>
-        <w:rPr>
-          <w:color w:val="FFFFFF"/>
-        </w:rPr>
-        <w:t xml:space="preserve">                                                                                                                        </w:t>
-      </w:r>
-    </w:p>
-    <w:p>
-      <w:pPr>
-        <w:spacing w:after="60"/>
-      </w:pPr>
-      <w:r>
-        <w:rPr>
-          <w:b/>
-          <w:color w:val="1D3E6E"/>
-        </w:rPr>
-        <w:t xml:space="preserve">5.  </w:t>
-      </w:r>
-      <w:r>
-        <w:t>Que diferença você faria entre desmoralização diante de doença avançada e episódio depressivo maior? Que dado do caso sustenta cada leitura?</w:t>
-      </w:r>
-    </w:p>
-    <w:p>
-      <w:pPr>
-        <w:pBdr>
-          <w:bottom w:val="single" w:sz="6" w:space="4" w:color="C8C8C0"/>
-        </w:pBdr>
-        <w:spacing w:after="90"/>
-      </w:pPr>
-      <w:r>
-        <w:rPr>
-          <w:color w:val="FFFFFF"/>
-        </w:rPr>
-        <w:t xml:space="preserve">                                                                                                                        </w:t>
-      </w:r>
-    </w:p>
-    <w:p>
-      <w:pPr>
-        <w:pBdr>
-          <w:bottom w:val="single" w:sz="6" w:space="4" w:color="C8C8C0"/>
-        </w:pBdr>
-        <w:spacing w:after="90"/>
-      </w:pPr>
-      <w:r>
-        <w:rPr>
-          <w:color w:val="FFFFFF"/>
-        </w:rPr>
-        <w:t xml:space="preserve">                                                                                                                        </w:t>
-      </w:r>
-    </w:p>
-    <w:p>
-      <w:pPr>
-        <w:spacing w:after="60"/>
-      </w:pPr>
-      <w:r>
-        <w:rPr>
-          <w:b/>
-          <w:color w:val="1D3E6E"/>
-        </w:rPr>
-        <w:t xml:space="preserve">6.  </w:t>
-      </w:r>
-      <w:r>
-        <w:t>Qual é a conduta? Justifique em uma frase, como escreveria no laudo.</w:t>
-      </w:r>
-    </w:p>
-    <w:p>
-      <w:pPr>
-        <w:pBdr>
-          <w:bottom w:val="single" w:sz="6" w:space="4" w:color="C8C8C0"/>
-        </w:pBdr>
-        <w:spacing w:after="90"/>
-      </w:pPr>
-      <w:r>
-        <w:rPr>
-          <w:color w:val="FFFFFF"/>
-        </w:rPr>
-        <w:t xml:space="preserve">                                                                                                                        </w:t>
+        <w:t xml:space="preserve">                                                                         </w:t>
       </w:r>
     </w:p>
     <w:p>

</xml_diff>